<commit_message>
nmv 07 08 2026
</commit_message>
<xml_diff>
--- a/SIkShA/navapada sayya.docx
+++ b/SIkShA/navapada sayya.docx
@@ -1,6 +1,6 @@
 
 <file path=word/document.xml><?xml version="1.0" encoding="utf-8"?>
-<w:document xmlns:wpc="http://schemas.microsoft.com/office/word/2010/wordprocessingCanvas" xmlns:cx="http://schemas.microsoft.com/office/drawing/2014/chartex" xmlns:cx1="http://schemas.microsoft.com/office/drawing/2015/9/8/chartex" xmlns:cx2="http://schemas.microsoft.com/office/drawing/2015/10/21/chartex" xmlns:cx3="http://schemas.microsoft.com/office/drawing/2016/5/9/chartex" xmlns:cx4="http://schemas.microsoft.com/office/drawing/2016/5/10/chartex" xmlns:cx5="http://schemas.microsoft.com/office/drawing/2016/5/11/chartex" xmlns:cx6="http://schemas.microsoft.com/office/drawing/2016/5/12/chartex" xmlns:cx7="http://schemas.microsoft.com/office/drawing/2016/5/13/chartex" xmlns:cx8="http://schemas.microsoft.com/office/drawing/2016/5/14/chartex" xmlns:mc="http://schemas.openxmlformats.org/markup-compatibility/2006" xmlns:aink="http://schemas.microsoft.com/office/drawing/2016/ink" xmlns:am3d="http://schemas.microsoft.com/office/drawing/2017/model3d" xmlns:o="urn:schemas-microsoft-com:office:office" xmlns:oel="http://schemas.microsoft.com/office/2019/extlst" xmlns:r="http://schemas.openxmlformats.org/officeDocument/2006/relationships" xmlns:m="http://schemas.openxmlformats.org/officeDocument/2006/math" xmlns:v="urn:schemas-microsoft-com:vml" xmlns:wp14="http://schemas.microsoft.com/office/word/2010/wordprocessingDrawing" xmlns:wp="http://schemas.openxmlformats.org/drawingml/2006/wordprocessingDrawing" xmlns:w10="urn:schemas-microsoft-com:office:word" xmlns:w="http://schemas.openxmlformats.org/wordprocessingml/2006/main" xmlns:w14="http://schemas.microsoft.com/office/word/2010/wordml" xmlns:w15="http://schemas.microsoft.com/office/word/2012/wordml" xmlns:w16cex="http://schemas.microsoft.com/office/word/2018/wordml/cex" xmlns:w16cid="http://schemas.microsoft.com/office/word/2016/wordml/cid" xmlns:w16="http://schemas.microsoft.com/office/word/2018/wordml" xmlns:w16du="http://schemas.microsoft.com/office/word/2023/wordml/word16du" xmlns:w16sdtdh="http://schemas.microsoft.com/office/word/2020/wordml/sdtdatahash" xmlns:w16se="http://schemas.microsoft.com/office/word/2015/wordml/symex" xmlns:wpg="http://schemas.microsoft.com/office/word/2010/wordprocessingGroup" xmlns:wpi="http://schemas.microsoft.com/office/word/2010/wordprocessingInk" xmlns:wne="http://schemas.microsoft.com/office/word/2006/wordml" xmlns:wps="http://schemas.microsoft.com/office/word/2010/wordprocessingShape" mc:Ignorable="w14 w15 w16se w16cid w16 w16cex w16sdtdh w16du wp14">
+<w:document xmlns:wpc="http://schemas.microsoft.com/office/word/2010/wordprocessingCanvas" xmlns:cx="http://schemas.microsoft.com/office/drawing/2014/chartex" xmlns:cx1="http://schemas.microsoft.com/office/drawing/2015/9/8/chartex" xmlns:cx2="http://schemas.microsoft.com/office/drawing/2015/10/21/chartex" xmlns:cx3="http://schemas.microsoft.com/office/drawing/2016/5/9/chartex" xmlns:cx4="http://schemas.microsoft.com/office/drawing/2016/5/10/chartex" xmlns:cx5="http://schemas.microsoft.com/office/drawing/2016/5/11/chartex" xmlns:cx6="http://schemas.microsoft.com/office/drawing/2016/5/12/chartex" xmlns:cx7="http://schemas.microsoft.com/office/drawing/2016/5/13/chartex" xmlns:cx8="http://schemas.microsoft.com/office/drawing/2016/5/14/chartex" xmlns:mc="http://schemas.openxmlformats.org/markup-compatibility/2006" xmlns:aink="http://schemas.microsoft.com/office/drawing/2016/ink" xmlns:am3d="http://schemas.microsoft.com/office/drawing/2017/model3d" xmlns:o="urn:schemas-microsoft-com:office:office" xmlns:oel="http://schemas.microsoft.com/office/2019/extlst" xmlns:r="http://schemas.openxmlformats.org/officeDocument/2006/relationships" xmlns:m="http://schemas.openxmlformats.org/officeDocument/2006/math" xmlns:v="urn:schemas-microsoft-com:vml" xmlns:wp14="http://schemas.microsoft.com/office/word/2010/wordprocessingDrawing" xmlns:wp="http://schemas.openxmlformats.org/drawingml/2006/wordprocessingDrawing" xmlns:w10="urn:schemas-microsoft-com:office:word" xmlns:w="http://schemas.openxmlformats.org/wordprocessingml/2006/main" xmlns:w14="http://schemas.microsoft.com/office/word/2010/wordml" xmlns:w15="http://schemas.microsoft.com/office/word/2012/wordml" xmlns:w16cei="http://schemas.microsoft.com/office/word/2026/wordml/cei" xmlns:w16cex="http://schemas.microsoft.com/office/word/2018/wordml/cex" xmlns:w16cid="http://schemas.microsoft.com/office/word/2016/wordml/cid" xmlns:w16="http://schemas.microsoft.com/office/word/2018/wordml" xmlns:w16du="http://schemas.microsoft.com/office/word/2023/wordml/word16du" xmlns:w16sdtdh="http://schemas.microsoft.com/office/word/2020/wordml/sdtdatahash" xmlns:w16sdtfl="http://schemas.microsoft.com/office/word/2024/wordml/sdtformatlock" xmlns:w16se="http://schemas.microsoft.com/office/word/2015/wordml/symex" xmlns:wpg="http://schemas.microsoft.com/office/word/2010/wordprocessingGroup" xmlns:wpi="http://schemas.microsoft.com/office/word/2010/wordprocessingInk" xmlns:wne="http://schemas.microsoft.com/office/word/2006/wordml" xmlns:wps="http://schemas.microsoft.com/office/word/2010/wordprocessingShape" mc:Ignorable="w14 w15 w16se w16cid w16 w16cex w16sdtdh w16sdtfl w16du wp14">
   <w:body>
     <w:p>
       <w:pPr>
@@ -10,75 +10,106 @@
         <w:adjustRightInd w:val="0"/>
         <w:spacing w:after="0" w:line="240" w:lineRule="auto"/>
         <w:rPr>
-          <w:rFonts w:ascii="BRH Devanagari Extra" w:hAnsi="BRH Devanagari Extra" w:cs="BRH Devanagari Extra"/>
-          <w:color w:val="000000"/>
-          <w:kern w:val="0"/>
-          <w:sz w:val="48"/>
-          <w:szCs w:val="48"/>
+          <w:rFonts w:ascii="Arial" w:hAnsi="Arial" w:cs="Arial"/>
+          <w:color w:val="000000"/>
+          <w:kern w:val="0"/>
+          <w:sz w:val="36"/>
+          <w:szCs w:val="36"/>
+          <w:lang w:val="en-US"/>
         </w:rPr>
       </w:pPr>
       <w:r>
         <w:rPr>
-          <w:rFonts w:ascii="BRH Devanagari Extra" w:hAnsi="BRH Devanagari Extra" w:cs="BRH Devanagari Extra"/>
-          <w:color w:val="000000"/>
-          <w:kern w:val="0"/>
-          <w:sz w:val="48"/>
-          <w:szCs w:val="48"/>
-        </w:rPr>
-        <w:t>1. AliÉ ESÉ¨ÉqÉç - Eý</w:t>
-      </w:r>
-      <w:r>
-        <w:rPr>
-          <w:rFonts w:ascii="BRH Devanagari Extra" w:hAnsi="BRH Devanagari Extra" w:cs="BRH Devanagari Extra"/>
-          <w:color w:val="000000"/>
-          <w:kern w:val="0"/>
-          <w:sz w:val="48"/>
-          <w:szCs w:val="48"/>
-          <w:highlight w:val="green"/>
-        </w:rPr>
-        <w:t>iÉÉå</w:t>
-      </w:r>
-      <w:r>
-        <w:rPr>
-          <w:rFonts w:ascii="BRH Devanagari Extra" w:hAnsi="BRH Devanagari Extra" w:cs="BRH Devanagari Extra"/>
-          <w:color w:val="000000"/>
-          <w:kern w:val="0"/>
-          <w:sz w:val="48"/>
-          <w:szCs w:val="48"/>
-        </w:rPr>
-        <w:t>, ÍzÉý</w:t>
-      </w:r>
-      <w:r>
-        <w:rPr>
-          <w:rFonts w:ascii="BRH Devanagari Extra" w:hAnsi="BRH Devanagari Extra" w:cs="BRH Devanagari Extra"/>
-          <w:color w:val="000000"/>
-          <w:kern w:val="0"/>
-          <w:sz w:val="48"/>
-          <w:szCs w:val="48"/>
-          <w:highlight w:val="green"/>
-        </w:rPr>
-        <w:t>uÉq</w:t>
-      </w:r>
-      <w:r>
-        <w:rPr>
-          <w:rFonts w:ascii="BRH Devanagari Extra" w:hAnsi="BRH Devanagari Extra" w:cs="BRH Devanagari Extra"/>
-          <w:color w:val="000000"/>
-          <w:kern w:val="0"/>
-          <w:sz w:val="48"/>
-          <w:szCs w:val="48"/>
-        </w:rPr>
-        <w:t>Éç, AýrÉý</w:t>
-      </w:r>
-      <w:r>
-        <w:rPr>
-          <w:rFonts w:ascii="BRH Devanagari Extra" w:hAnsi="BRH Devanagari Extra" w:cs="BRH Devanagari Extra"/>
-          <w:color w:val="000000"/>
-          <w:kern w:val="0"/>
-          <w:sz w:val="48"/>
-          <w:szCs w:val="48"/>
-          <w:highlight w:val="green"/>
-        </w:rPr>
-        <w:t>¤ÉqÉç</w:t>
+          <w:rFonts w:ascii="Arial" w:hAnsi="Arial" w:cs="Arial"/>
+          <w:color w:val="000000"/>
+          <w:kern w:val="0"/>
+          <w:sz w:val="36"/>
+          <w:szCs w:val="36"/>
+        </w:rPr>
+        <w:t xml:space="preserve">9 types of possible swarams </w:t>
+      </w:r>
+      <w:r>
+        <w:rPr>
+          <w:rFonts w:ascii="Arial" w:hAnsi="Arial" w:cs="Arial"/>
+          <w:color w:val="000000"/>
+          <w:kern w:val="0"/>
+          <w:sz w:val="36"/>
+          <w:szCs w:val="36"/>
+        </w:rPr>
+        <w:t xml:space="preserve"> for a word (only applicable for a single padam) </w:t>
+      </w:r>
+      <w:r>
+        <w:rPr>
+          <w:rFonts w:ascii="Arial" w:hAnsi="Arial" w:cs="Arial"/>
+          <w:color w:val="000000"/>
+          <w:kern w:val="0"/>
+          <w:sz w:val="36"/>
+          <w:szCs w:val="36"/>
+        </w:rPr>
+        <w:t>are given by Panini Maharshi , as follows</w:t>
+      </w:r>
+      <w:r>
+        <w:rPr>
+          <w:rFonts w:ascii="Arial" w:hAnsi="Arial" w:cs="Arial"/>
+          <w:color w:val="000000"/>
+          <w:kern w:val="0"/>
+          <w:sz w:val="36"/>
+          <w:szCs w:val="36"/>
+        </w:rPr>
+        <w:t>. The Maharishi terms these 9 words as “ Navapada sayyaa” ( “</w:t>
+      </w:r>
+      <w:r>
+        <w:rPr>
+          <w:rFonts w:ascii="Mangal" w:hAnsi="Mangal" w:cs="Mangal" w:hint="cs"/>
+          <w:color w:val="000000"/>
+          <w:kern w:val="0"/>
+          <w:sz w:val="36"/>
+          <w:szCs w:val="36"/>
+          <w:cs/>
+        </w:rPr>
+        <w:t>नवपद</w:t>
+      </w:r>
+      <w:r>
+        <w:rPr>
+          <w:rFonts w:ascii="Arial" w:hAnsi="Arial" w:cs="Arial"/>
+          <w:color w:val="000000"/>
+          <w:kern w:val="0"/>
+          <w:sz w:val="36"/>
+          <w:szCs w:val="36"/>
+          <w:cs/>
+        </w:rPr>
+        <w:t xml:space="preserve"> </w:t>
+      </w:r>
+      <w:r>
+        <w:rPr>
+          <w:rFonts w:ascii="Mangal" w:hAnsi="Mangal" w:cs="Mangal" w:hint="cs"/>
+          <w:color w:val="000000"/>
+          <w:kern w:val="0"/>
+          <w:sz w:val="36"/>
+          <w:szCs w:val="36"/>
+          <w:cs/>
+        </w:rPr>
+        <w:t>शय्या</w:t>
+      </w:r>
+      <w:r>
+        <w:rPr>
+          <w:rFonts w:ascii="Mangal" w:hAnsi="Mangal" w:cs="Mangal"/>
+          <w:color w:val="000000"/>
+          <w:kern w:val="0"/>
+          <w:sz w:val="36"/>
+          <w:szCs w:val="36"/>
+        </w:rPr>
+        <w:t>”</w:t>
+      </w:r>
+      <w:r>
+        <w:rPr>
+          <w:rFonts w:ascii="Mangal" w:hAnsi="Mangal" w:cs="Mangal"/>
+          <w:color w:val="000000"/>
+          <w:kern w:val="0"/>
+          <w:sz w:val="36"/>
+          <w:szCs w:val="36"/>
+        </w:rPr>
+        <w:t xml:space="preserve"> )</w:t>
       </w:r>
     </w:p>
     <w:p>
@@ -89,107 +120,13 @@
         <w:adjustRightInd w:val="0"/>
         <w:spacing w:after="0" w:line="240" w:lineRule="auto"/>
         <w:rPr>
-          <w:rFonts w:ascii="BRH Devanagari Extra" w:hAnsi="BRH Devanagari Extra" w:cs="BRH Devanagari Extra"/>
-          <w:color w:val="000000"/>
-          <w:kern w:val="0"/>
-          <w:sz w:val="48"/>
-          <w:szCs w:val="48"/>
+          <w:rFonts w:ascii="BRH Devanagari" w:hAnsi="BRH Devanagari" w:cs="BRH Devanagari"/>
+          <w:color w:val="000000"/>
+          <w:kern w:val="0"/>
+          <w:sz w:val="40"/>
+          <w:szCs w:val="40"/>
         </w:rPr>
       </w:pPr>
-      <w:r>
-        <w:rPr>
-          <w:rFonts w:ascii="BRH Devanagari Extra" w:hAnsi="BRH Devanagari Extra" w:cs="BRH Devanagari Extra"/>
-          <w:color w:val="000000"/>
-          <w:kern w:val="0"/>
-          <w:sz w:val="48"/>
-          <w:szCs w:val="48"/>
-        </w:rPr>
-        <w:t xml:space="preserve">2. AÉ± ESÉ¨ÉqÉç - </w:t>
-      </w:r>
-      <w:r>
-        <w:rPr>
-          <w:rFonts w:ascii="BRH Devanagari Extra" w:hAnsi="BRH Devanagari Extra" w:cs="BRH Devanagari Extra"/>
-          <w:color w:val="000000"/>
-          <w:kern w:val="0"/>
-          <w:sz w:val="48"/>
-          <w:szCs w:val="48"/>
-          <w:highlight w:val="green"/>
-        </w:rPr>
-        <w:t>lÉ</w:t>
-      </w:r>
-      <w:r>
-        <w:rPr>
-          <w:rFonts w:ascii="BRH Devanagari Extra" w:hAnsi="BRH Devanagari Extra" w:cs="BRH Devanagari Extra"/>
-          <w:color w:val="000000"/>
-          <w:kern w:val="0"/>
-          <w:sz w:val="48"/>
-          <w:szCs w:val="48"/>
-        </w:rPr>
-        <w:t xml:space="preserve">qÉþÈ, </w:t>
-      </w:r>
-      <w:r>
-        <w:rPr>
-          <w:rFonts w:ascii="BRH Devanagari Extra" w:hAnsi="BRH Devanagari Extra" w:cs="BRH Devanagari Extra"/>
-          <w:color w:val="000000"/>
-          <w:kern w:val="0"/>
-          <w:sz w:val="48"/>
-          <w:szCs w:val="48"/>
-          <w:highlight w:val="green"/>
-        </w:rPr>
-        <w:t>C</w:t>
-      </w:r>
-      <w:r>
-        <w:rPr>
-          <w:rFonts w:ascii="BRH Devanagari Extra" w:hAnsi="BRH Devanagari Extra" w:cs="BRH Devanagari Extra"/>
-          <w:color w:val="000000"/>
-          <w:kern w:val="0"/>
-          <w:sz w:val="48"/>
-          <w:szCs w:val="48"/>
-        </w:rPr>
-        <w:t xml:space="preserve">wÉþuÉå, </w:t>
-      </w:r>
-      <w:r>
-        <w:rPr>
-          <w:rFonts w:ascii="BRH Devanagari Extra" w:hAnsi="BRH Devanagari Extra" w:cs="BRH Devanagari Extra"/>
-          <w:color w:val="000000"/>
-          <w:kern w:val="0"/>
-          <w:sz w:val="48"/>
-          <w:szCs w:val="48"/>
-          <w:highlight w:val="green"/>
-        </w:rPr>
-        <w:t>xÉ</w:t>
-      </w:r>
-      <w:r>
-        <w:rPr>
-          <w:rFonts w:ascii="BRH Devanagari Extra" w:hAnsi="BRH Devanagari Extra" w:cs="BRH Devanagari Extra"/>
-          <w:color w:val="000000"/>
-          <w:kern w:val="0"/>
-          <w:sz w:val="48"/>
-          <w:szCs w:val="48"/>
-        </w:rPr>
-        <w:t xml:space="preserve">uÉïÿqÉç, </w:t>
-      </w:r>
-      <w:r>
-        <w:rPr>
-          <w:rFonts w:ascii="BRH Devanagari Extra" w:hAnsi="BRH Devanagari Extra" w:cs="BRH Devanagari Extra"/>
-          <w:color w:val="000000"/>
-          <w:kern w:val="0"/>
-          <w:sz w:val="48"/>
-          <w:szCs w:val="48"/>
-          <w:highlight w:val="green"/>
-        </w:rPr>
-        <w:t>A</w:t>
-      </w:r>
-      <w:r>
-        <w:rPr>
-          <w:rFonts w:ascii="BRH Devanagari Extra" w:hAnsi="BRH Devanagari Extra" w:cs="BRH Devanagari Extra"/>
-          <w:color w:val="000000"/>
-          <w:kern w:val="0"/>
-          <w:sz w:val="48"/>
-          <w:szCs w:val="48"/>
-        </w:rPr>
-        <w:t>mÉÉþmÉMüÉÍzÉlÉÏ</w:t>
-      </w:r>
     </w:p>
     <w:p>
       <w:pPr>
@@ -202,8 +139,8 @@
           <w:rFonts w:ascii="BRH Devanagari" w:hAnsi="BRH Devanagari" w:cs="BRH Devanagari"/>
           <w:color w:val="000000"/>
           <w:kern w:val="0"/>
-          <w:sz w:val="48"/>
-          <w:szCs w:val="48"/>
+          <w:sz w:val="36"/>
+          <w:szCs w:val="36"/>
         </w:rPr>
       </w:pPr>
       <w:r>
@@ -211,63 +148,10 @@
           <w:rFonts w:ascii="BRH Devanagari" w:hAnsi="BRH Devanagari" w:cs="BRH Devanagari"/>
           <w:color w:val="000000"/>
           <w:kern w:val="0"/>
-          <w:sz w:val="48"/>
-          <w:szCs w:val="48"/>
-        </w:rPr>
-        <w:t xml:space="preserve">3. ESÉ¨ÉqÉç - </w:t>
-      </w:r>
-      <w:r>
-        <w:rPr>
-          <w:rFonts w:ascii="BRH Devanagari" w:hAnsi="BRH Devanagari" w:cs="BRH Devanagari"/>
-          <w:color w:val="000000"/>
-          <w:kern w:val="0"/>
-          <w:sz w:val="48"/>
-          <w:szCs w:val="48"/>
-          <w:highlight w:val="green"/>
-        </w:rPr>
-        <w:t>rÉÉ,</w:t>
-      </w:r>
-      <w:r>
-        <w:rPr>
-          <w:rFonts w:ascii="BRH Devanagari" w:hAnsi="BRH Devanagari" w:cs="BRH Devanagari"/>
-          <w:color w:val="000000"/>
-          <w:kern w:val="0"/>
-          <w:sz w:val="48"/>
-          <w:szCs w:val="48"/>
-        </w:rPr>
-        <w:t xml:space="preserve"> </w:t>
-      </w:r>
-      <w:r>
-        <w:rPr>
-          <w:rFonts w:ascii="BRH Devanagari" w:hAnsi="BRH Devanagari" w:cs="BRH Devanagari"/>
-          <w:color w:val="000000"/>
-          <w:kern w:val="0"/>
-          <w:sz w:val="48"/>
-          <w:szCs w:val="48"/>
-          <w:highlight w:val="green"/>
-        </w:rPr>
-        <w:t>qÉÉ</w:t>
-      </w:r>
-      <w:r>
-        <w:rPr>
-          <w:rFonts w:ascii="BRH Devanagari" w:hAnsi="BRH Devanagari" w:cs="BRH Devanagari"/>
-          <w:color w:val="000000"/>
-          <w:kern w:val="0"/>
-          <w:sz w:val="48"/>
-          <w:szCs w:val="48"/>
-        </w:rPr>
-        <w:t xml:space="preserve">, </w:t>
-      </w:r>
-      <w:r>
-        <w:rPr>
-          <w:rFonts w:ascii="BRH Devanagari" w:hAnsi="BRH Devanagari" w:cs="BRH Devanagari"/>
-          <w:color w:val="000000"/>
-          <w:kern w:val="0"/>
-          <w:sz w:val="48"/>
-          <w:szCs w:val="48"/>
-          <w:highlight w:val="green"/>
-        </w:rPr>
-        <w:t>mÉë</w:t>
+          <w:sz w:val="36"/>
+          <w:szCs w:val="36"/>
+        </w:rPr>
+        <w:t>AliÉÉåSÉ¨É-qÉÉ±ÑS¨É-qÉÑSÉ¨É-qÉlÉÑSÉiÉlÉç-lÉÏcÉxuÉËUiÉqÉç |</w:t>
       </w:r>
     </w:p>
     <w:p>
@@ -278,20 +162,408 @@
         <w:adjustRightInd w:val="0"/>
         <w:spacing w:after="0" w:line="240" w:lineRule="auto"/>
         <w:rPr>
-          <w:rFonts w:ascii="BRH Devanagari Extra" w:hAnsi="BRH Devanagari Extra" w:cs="BRH Devanagari Extra"/>
-          <w:color w:val="000000"/>
-          <w:kern w:val="0"/>
-          <w:sz w:val="48"/>
-          <w:szCs w:val="48"/>
+          <w:rFonts w:ascii="BRH Devanagari" w:hAnsi="BRH Devanagari" w:cs="BRH Devanagari"/>
+          <w:color w:val="000000"/>
+          <w:kern w:val="0"/>
+          <w:sz w:val="36"/>
+          <w:szCs w:val="36"/>
         </w:rPr>
       </w:pPr>
       <w:r>
         <w:rPr>
-          <w:rFonts w:ascii="BRH Devanagari Extra" w:hAnsi="BRH Devanagari Extra" w:cs="BRH Devanagari Extra"/>
-          <w:color w:val="000000"/>
-          <w:kern w:val="0"/>
-          <w:sz w:val="48"/>
-          <w:szCs w:val="48"/>
+          <w:rFonts w:ascii="BRH Devanagari" w:hAnsi="BRH Devanagari" w:cs="BRH Devanagari"/>
+          <w:color w:val="000000"/>
+          <w:kern w:val="0"/>
+          <w:sz w:val="36"/>
+          <w:szCs w:val="36"/>
+        </w:rPr>
+        <w:t xml:space="preserve">qÉkrÉÉåSÉ¨ÉÇ - xuÉËUiÉÇ - SèurÉÑSÉ¨ÉÇ - §rÉÑSÉ¨ÉÍqÉÌiÉ lÉuÉmÉSzÉrrÉÉ || </w:t>
+      </w:r>
+    </w:p>
+    <w:p>
+      <w:pPr>
+        <w:widowControl w:val="0"/>
+        <w:autoSpaceDE w:val="0"/>
+        <w:autoSpaceDN w:val="0"/>
+        <w:adjustRightInd w:val="0"/>
+        <w:spacing w:after="0" w:line="240" w:lineRule="auto"/>
+        <w:rPr>
+          <w:rFonts w:ascii="BRH Devanagari" w:hAnsi="BRH Devanagari" w:cs="BRH Devanagari"/>
+          <w:color w:val="000000"/>
+          <w:kern w:val="0"/>
+          <w:sz w:val="36"/>
+          <w:szCs w:val="36"/>
+        </w:rPr>
+      </w:pPr>
+      <w:r>
+        <w:rPr>
+          <w:rFonts w:ascii="BRH Devanagari" w:hAnsi="BRH Devanagari" w:cs="BRH Devanagari"/>
+          <w:color w:val="000000"/>
+          <w:kern w:val="0"/>
+          <w:sz w:val="36"/>
+          <w:szCs w:val="36"/>
+        </w:rPr>
+        <w:t xml:space="preserve">mÉÍhÉÌlÉ  qÉWûÌwÉï </w:t>
+      </w:r>
+      <w:r>
+        <w:rPr>
+          <w:rFonts w:ascii="BRH Devanagari" w:hAnsi="BRH Devanagari" w:cs="BRH Devanagari"/>
+          <w:color w:val="000000"/>
+          <w:kern w:val="0"/>
+          <w:sz w:val="36"/>
+          <w:szCs w:val="36"/>
+        </w:rPr>
+        <w:t>-</w:t>
+      </w:r>
+      <w:r>
+        <w:rPr>
+          <w:rFonts w:ascii="BRH Devanagari" w:hAnsi="BRH Devanagari" w:cs="BRH Devanagari"/>
+          <w:color w:val="000000"/>
+          <w:kern w:val="0"/>
+          <w:sz w:val="36"/>
+          <w:szCs w:val="36"/>
+        </w:rPr>
+        <w:t xml:space="preserve"> 45</w:t>
+      </w:r>
+    </w:p>
+    <w:p>
+      <w:pPr>
+        <w:widowControl w:val="0"/>
+        <w:autoSpaceDE w:val="0"/>
+        <w:autoSpaceDN w:val="0"/>
+        <w:adjustRightInd w:val="0"/>
+        <w:spacing w:after="0" w:line="240" w:lineRule="auto"/>
+        <w:rPr>
+          <w:rFonts w:ascii="BRH Devanagari" w:hAnsi="BRH Devanagari" w:cs="BRH Devanagari"/>
+          <w:color w:val="000000"/>
+          <w:kern w:val="0"/>
+          <w:sz w:val="40"/>
+          <w:szCs w:val="40"/>
+        </w:rPr>
+      </w:pPr>
+    </w:p>
+    <w:p>
+      <w:pPr>
+        <w:widowControl w:val="0"/>
+        <w:autoSpaceDE w:val="0"/>
+        <w:autoSpaceDN w:val="0"/>
+        <w:adjustRightInd w:val="0"/>
+        <w:spacing w:after="0" w:line="240" w:lineRule="auto"/>
+        <w:rPr>
+          <w:rFonts w:ascii="Arial" w:hAnsi="Arial" w:cs="Arial"/>
+          <w:b/>
+          <w:bCs/>
+          <w:color w:val="000000"/>
+          <w:kern w:val="0"/>
+          <w:sz w:val="40"/>
+          <w:szCs w:val="40"/>
+          <w:u w:val="single"/>
+        </w:rPr>
+      </w:pPr>
+      <w:r>
+        <w:rPr>
+          <w:rFonts w:ascii="Arial" w:hAnsi="Arial" w:cs="Arial"/>
+          <w:b/>
+          <w:bCs/>
+          <w:color w:val="000000"/>
+          <w:kern w:val="0"/>
+          <w:sz w:val="40"/>
+          <w:szCs w:val="40"/>
+          <w:u w:val="single"/>
+        </w:rPr>
+        <w:t>A Few examples</w:t>
+      </w:r>
+    </w:p>
+    <w:p>
+      <w:pPr>
+        <w:widowControl w:val="0"/>
+        <w:autoSpaceDE w:val="0"/>
+        <w:autoSpaceDN w:val="0"/>
+        <w:adjustRightInd w:val="0"/>
+        <w:spacing w:after="0" w:line="240" w:lineRule="auto"/>
+        <w:rPr>
+          <w:rFonts w:ascii="BRH Devanagari Extra" w:hAnsi="BRH Devanagari Extra" w:cs="BRH Devanagari Extra"/>
+          <w:color w:val="000000"/>
+          <w:kern w:val="0"/>
+          <w:sz w:val="44"/>
+          <w:szCs w:val="44"/>
+        </w:rPr>
+      </w:pPr>
+      <w:r>
+        <w:rPr>
+          <w:rFonts w:ascii="BRH Devanagari Extra" w:hAnsi="BRH Devanagari Extra" w:cs="BRH Devanagari Extra"/>
+          <w:color w:val="000000"/>
+          <w:kern w:val="0"/>
+          <w:sz w:val="44"/>
+          <w:szCs w:val="44"/>
+        </w:rPr>
+        <w:t>1. AliÉ ESÉ¨ÉqÉç - Eý</w:t>
+      </w:r>
+      <w:r>
+        <w:rPr>
+          <w:rFonts w:ascii="BRH Devanagari Extra" w:hAnsi="BRH Devanagari Extra" w:cs="BRH Devanagari Extra"/>
+          <w:color w:val="000000"/>
+          <w:kern w:val="0"/>
+          <w:sz w:val="44"/>
+          <w:szCs w:val="44"/>
+          <w:highlight w:val="green"/>
+        </w:rPr>
+        <w:t>iÉÉå</w:t>
+      </w:r>
+      <w:r>
+        <w:rPr>
+          <w:rFonts w:ascii="BRH Devanagari Extra" w:hAnsi="BRH Devanagari Extra" w:cs="BRH Devanagari Extra"/>
+          <w:color w:val="000000"/>
+          <w:kern w:val="0"/>
+          <w:sz w:val="44"/>
+          <w:szCs w:val="44"/>
+        </w:rPr>
+        <w:t>, ÍzÉý</w:t>
+      </w:r>
+      <w:r>
+        <w:rPr>
+          <w:rFonts w:ascii="BRH Devanagari Extra" w:hAnsi="BRH Devanagari Extra" w:cs="BRH Devanagari Extra"/>
+          <w:color w:val="000000"/>
+          <w:kern w:val="0"/>
+          <w:sz w:val="44"/>
+          <w:szCs w:val="44"/>
+          <w:highlight w:val="green"/>
+        </w:rPr>
+        <w:t>uÉq</w:t>
+      </w:r>
+      <w:r>
+        <w:rPr>
+          <w:rFonts w:ascii="BRH Devanagari Extra" w:hAnsi="BRH Devanagari Extra" w:cs="BRH Devanagari Extra"/>
+          <w:color w:val="000000"/>
+          <w:kern w:val="0"/>
+          <w:sz w:val="44"/>
+          <w:szCs w:val="44"/>
+        </w:rPr>
+        <w:t>Éç, AýrÉý</w:t>
+      </w:r>
+      <w:r>
+        <w:rPr>
+          <w:rFonts w:ascii="BRH Devanagari Extra" w:hAnsi="BRH Devanagari Extra" w:cs="BRH Devanagari Extra"/>
+          <w:color w:val="000000"/>
+          <w:kern w:val="0"/>
+          <w:sz w:val="44"/>
+          <w:szCs w:val="44"/>
+          <w:highlight w:val="green"/>
+        </w:rPr>
+        <w:t>¤ÉqÉç</w:t>
+      </w:r>
+    </w:p>
+    <w:p>
+      <w:pPr>
+        <w:widowControl w:val="0"/>
+        <w:autoSpaceDE w:val="0"/>
+        <w:autoSpaceDN w:val="0"/>
+        <w:adjustRightInd w:val="0"/>
+        <w:spacing w:after="0" w:line="240" w:lineRule="auto"/>
+        <w:rPr>
+          <w:rFonts w:ascii="BRH Devanagari Extra" w:hAnsi="BRH Devanagari Extra" w:cs="BRH Devanagari Extra"/>
+          <w:color w:val="000000"/>
+          <w:kern w:val="0"/>
+          <w:sz w:val="44"/>
+          <w:szCs w:val="44"/>
+        </w:rPr>
+      </w:pPr>
+      <w:r>
+        <w:rPr>
+          <w:rFonts w:ascii="BRH Devanagari Extra" w:hAnsi="BRH Devanagari Extra" w:cs="BRH Devanagari Extra"/>
+          <w:color w:val="000000"/>
+          <w:kern w:val="0"/>
+          <w:sz w:val="44"/>
+          <w:szCs w:val="44"/>
+        </w:rPr>
+        <w:t xml:space="preserve">2. AÉ± ESÉ¨ÉqÉç - </w:t>
+      </w:r>
+      <w:r>
+        <w:rPr>
+          <w:rFonts w:ascii="BRH Devanagari Extra" w:hAnsi="BRH Devanagari Extra" w:cs="BRH Devanagari Extra"/>
+          <w:color w:val="000000"/>
+          <w:kern w:val="0"/>
+          <w:sz w:val="44"/>
+          <w:szCs w:val="44"/>
+          <w:highlight w:val="green"/>
+        </w:rPr>
+        <w:t>lÉ</w:t>
+      </w:r>
+      <w:r>
+        <w:rPr>
+          <w:rFonts w:ascii="BRH Devanagari Extra" w:hAnsi="BRH Devanagari Extra" w:cs="BRH Devanagari Extra"/>
+          <w:color w:val="000000"/>
+          <w:kern w:val="0"/>
+          <w:sz w:val="44"/>
+          <w:szCs w:val="44"/>
+        </w:rPr>
+        <w:t xml:space="preserve">qÉþÈ, </w:t>
+      </w:r>
+      <w:r>
+        <w:rPr>
+          <w:rFonts w:ascii="BRH Devanagari Extra" w:hAnsi="BRH Devanagari Extra" w:cs="BRH Devanagari Extra"/>
+          <w:color w:val="000000"/>
+          <w:kern w:val="0"/>
+          <w:sz w:val="44"/>
+          <w:szCs w:val="44"/>
+          <w:highlight w:val="green"/>
+        </w:rPr>
+        <w:t>C</w:t>
+      </w:r>
+      <w:r>
+        <w:rPr>
+          <w:rFonts w:ascii="BRH Devanagari Extra" w:hAnsi="BRH Devanagari Extra" w:cs="BRH Devanagari Extra"/>
+          <w:color w:val="000000"/>
+          <w:kern w:val="0"/>
+          <w:sz w:val="44"/>
+          <w:szCs w:val="44"/>
+        </w:rPr>
+        <w:t xml:space="preserve">wÉþuÉå, </w:t>
+      </w:r>
+      <w:r>
+        <w:rPr>
+          <w:rFonts w:ascii="BRH Devanagari Extra" w:hAnsi="BRH Devanagari Extra" w:cs="BRH Devanagari Extra"/>
+          <w:color w:val="000000"/>
+          <w:kern w:val="0"/>
+          <w:sz w:val="44"/>
+          <w:szCs w:val="44"/>
+          <w:highlight w:val="green"/>
+        </w:rPr>
+        <w:t>xÉ</w:t>
+      </w:r>
+      <w:r>
+        <w:rPr>
+          <w:rFonts w:ascii="BRH Devanagari Extra" w:hAnsi="BRH Devanagari Extra" w:cs="BRH Devanagari Extra"/>
+          <w:color w:val="000000"/>
+          <w:kern w:val="0"/>
+          <w:sz w:val="44"/>
+          <w:szCs w:val="44"/>
+        </w:rPr>
+        <w:t xml:space="preserve">uÉïÿqÉç, </w:t>
+      </w:r>
+      <w:r>
+        <w:rPr>
+          <w:rFonts w:ascii="BRH Devanagari Extra" w:hAnsi="BRH Devanagari Extra" w:cs="BRH Devanagari Extra"/>
+          <w:color w:val="000000"/>
+          <w:kern w:val="0"/>
+          <w:sz w:val="44"/>
+          <w:szCs w:val="44"/>
+          <w:highlight w:val="green"/>
+        </w:rPr>
+        <w:t>A</w:t>
+      </w:r>
+      <w:r>
+        <w:rPr>
+          <w:rFonts w:ascii="BRH Devanagari Extra" w:hAnsi="BRH Devanagari Extra" w:cs="BRH Devanagari Extra"/>
+          <w:color w:val="000000"/>
+          <w:kern w:val="0"/>
+          <w:sz w:val="44"/>
+          <w:szCs w:val="44"/>
+        </w:rPr>
+        <w:t>mÉÉþmÉMüÉÍzÉlÉÏ</w:t>
+      </w:r>
+    </w:p>
+    <w:p>
+      <w:pPr>
+        <w:widowControl w:val="0"/>
+        <w:autoSpaceDE w:val="0"/>
+        <w:autoSpaceDN w:val="0"/>
+        <w:adjustRightInd w:val="0"/>
+        <w:spacing w:after="0" w:line="240" w:lineRule="auto"/>
+        <w:rPr>
+          <w:rFonts w:ascii="BRH Devanagari" w:hAnsi="BRH Devanagari" w:cs="BRH Devanagari"/>
+          <w:color w:val="000000"/>
+          <w:kern w:val="0"/>
+          <w:sz w:val="44"/>
+          <w:szCs w:val="44"/>
+        </w:rPr>
+      </w:pPr>
+      <w:r>
+        <w:rPr>
+          <w:rFonts w:ascii="BRH Devanagari" w:hAnsi="BRH Devanagari" w:cs="BRH Devanagari"/>
+          <w:color w:val="000000"/>
+          <w:kern w:val="0"/>
+          <w:sz w:val="44"/>
+          <w:szCs w:val="44"/>
+        </w:rPr>
+        <w:t xml:space="preserve">3. ESÉ¨ÉqÉç - </w:t>
+      </w:r>
+      <w:r>
+        <w:rPr>
+          <w:rFonts w:ascii="BRH Devanagari" w:hAnsi="BRH Devanagari" w:cs="BRH Devanagari"/>
+          <w:color w:val="000000"/>
+          <w:kern w:val="0"/>
+          <w:sz w:val="44"/>
+          <w:szCs w:val="44"/>
+          <w:highlight w:val="green"/>
+        </w:rPr>
+        <w:t>rÉÉ,</w:t>
+      </w:r>
+      <w:r>
+        <w:rPr>
+          <w:rFonts w:ascii="BRH Devanagari" w:hAnsi="BRH Devanagari" w:cs="BRH Devanagari"/>
+          <w:color w:val="000000"/>
+          <w:kern w:val="0"/>
+          <w:sz w:val="44"/>
+          <w:szCs w:val="44"/>
+        </w:rPr>
+        <w:t xml:space="preserve"> </w:t>
+      </w:r>
+      <w:r>
+        <w:rPr>
+          <w:rFonts w:ascii="BRH Devanagari" w:hAnsi="BRH Devanagari" w:cs="BRH Devanagari"/>
+          <w:color w:val="000000"/>
+          <w:kern w:val="0"/>
+          <w:sz w:val="44"/>
+          <w:szCs w:val="44"/>
+          <w:highlight w:val="green"/>
+        </w:rPr>
+        <w:t>qÉÉ</w:t>
+      </w:r>
+      <w:r>
+        <w:rPr>
+          <w:rFonts w:ascii="BRH Devanagari" w:hAnsi="BRH Devanagari" w:cs="BRH Devanagari"/>
+          <w:color w:val="000000"/>
+          <w:kern w:val="0"/>
+          <w:sz w:val="44"/>
+          <w:szCs w:val="44"/>
+        </w:rPr>
+        <w:t xml:space="preserve">, </w:t>
+      </w:r>
+      <w:r>
+        <w:rPr>
+          <w:rFonts w:ascii="BRH Devanagari" w:hAnsi="BRH Devanagari" w:cs="BRH Devanagari"/>
+          <w:color w:val="000000"/>
+          <w:kern w:val="0"/>
+          <w:sz w:val="44"/>
+          <w:szCs w:val="44"/>
+          <w:highlight w:val="green"/>
+        </w:rPr>
+        <w:t>mÉë</w:t>
+      </w:r>
+    </w:p>
+    <w:p>
+      <w:pPr>
+        <w:widowControl w:val="0"/>
+        <w:autoSpaceDE w:val="0"/>
+        <w:autoSpaceDN w:val="0"/>
+        <w:adjustRightInd w:val="0"/>
+        <w:spacing w:after="0" w:line="240" w:lineRule="auto"/>
+        <w:rPr>
+          <w:rFonts w:ascii="BRH Devanagari Extra" w:hAnsi="BRH Devanagari Extra" w:cs="BRH Devanagari Extra"/>
+          <w:color w:val="000000"/>
+          <w:kern w:val="0"/>
+          <w:sz w:val="44"/>
+          <w:szCs w:val="44"/>
+        </w:rPr>
+      </w:pPr>
+      <w:r>
+        <w:rPr>
+          <w:rFonts w:ascii="BRH Devanagari Extra" w:hAnsi="BRH Devanagari Extra" w:cs="BRH Devanagari Extra"/>
+          <w:color w:val="000000"/>
+          <w:kern w:val="0"/>
+          <w:sz w:val="44"/>
+          <w:szCs w:val="44"/>
         </w:rPr>
         <w:t xml:space="preserve">4. AlÉÑSÉ¨ÉqÉç (xÉuÉÉïlÉÑSÉ¨ÉqÉç) - </w:t>
       </w:r>
@@ -300,8 +572,8 @@
           <w:rFonts w:ascii="BRH Devanagari Extra" w:hAnsi="BRH Devanagari Extra" w:cs="BRH Devanagari Extra"/>
           <w:color w:val="000000"/>
           <w:kern w:val="0"/>
-          <w:sz w:val="48"/>
-          <w:szCs w:val="48"/>
+          <w:sz w:val="44"/>
+          <w:szCs w:val="44"/>
           <w:highlight w:val="green"/>
         </w:rPr>
         <w:t>ÌWûý(aqÉç)ýxÉÏýÈ</w:t>
@@ -311,8 +583,8 @@
           <w:rFonts w:ascii="BRH Devanagari Extra" w:hAnsi="BRH Devanagari Extra" w:cs="BRH Devanagari Extra"/>
           <w:color w:val="000000"/>
           <w:kern w:val="0"/>
-          <w:sz w:val="48"/>
-          <w:szCs w:val="48"/>
+          <w:sz w:val="44"/>
+          <w:szCs w:val="44"/>
         </w:rPr>
         <w:t xml:space="preserve">, </w:t>
       </w:r>
@@ -321,8 +593,8 @@
           <w:rFonts w:ascii="BRH Devanagari Extra" w:hAnsi="BRH Devanagari Extra" w:cs="BRH Devanagari Extra"/>
           <w:color w:val="000000"/>
           <w:kern w:val="0"/>
-          <w:sz w:val="48"/>
-          <w:szCs w:val="48"/>
+          <w:sz w:val="44"/>
+          <w:szCs w:val="44"/>
           <w:highlight w:val="green"/>
         </w:rPr>
         <w:t>iuÉÉý</w:t>
@@ -332,8 +604,8 @@
           <w:rFonts w:ascii="BRH Devanagari Extra" w:hAnsi="BRH Devanagari Extra" w:cs="BRH Devanagari Extra"/>
           <w:color w:val="000000"/>
           <w:kern w:val="0"/>
-          <w:sz w:val="48"/>
-          <w:szCs w:val="48"/>
+          <w:sz w:val="44"/>
+          <w:szCs w:val="44"/>
         </w:rPr>
         <w:t xml:space="preserve">, </w:t>
       </w:r>
@@ -342,8 +614,8 @@
           <w:rFonts w:ascii="BRH Devanagari Extra" w:hAnsi="BRH Devanagari Extra" w:cs="BRH Devanagari Extra"/>
           <w:color w:val="000000"/>
           <w:kern w:val="0"/>
-          <w:sz w:val="48"/>
-          <w:szCs w:val="48"/>
+          <w:sz w:val="44"/>
+          <w:szCs w:val="44"/>
           <w:highlight w:val="green"/>
         </w:rPr>
         <w:t>uÉýSÉýqÉýÍxÉý</w:t>
@@ -361,8 +633,8 @@
           <w:rFonts w:ascii="BRH Devanagari Extra" w:hAnsi="BRH Devanagari Extra" w:cs="BRH Devanagari Extra"/>
           <w:color w:val="000000"/>
           <w:kern w:val="0"/>
-          <w:sz w:val="48"/>
-          <w:szCs w:val="48"/>
+          <w:sz w:val="44"/>
+          <w:szCs w:val="44"/>
         </w:rPr>
       </w:pPr>
       <w:r>
@@ -370,8 +642,8 @@
           <w:rFonts w:ascii="BRH Devanagari Extra" w:hAnsi="BRH Devanagari Extra" w:cs="BRH Devanagari Extra"/>
           <w:color w:val="000000"/>
           <w:kern w:val="0"/>
-          <w:sz w:val="48"/>
-          <w:szCs w:val="48"/>
+          <w:sz w:val="44"/>
+          <w:szCs w:val="44"/>
         </w:rPr>
         <w:t>5. lÉÏcÉxuÉËUiÉqÉç - rÉÉýiÉÑý</w:t>
       </w:r>
@@ -380,8 +652,8 @@
           <w:rFonts w:ascii="BRH Devanagari Extra" w:hAnsi="BRH Devanagari Extra" w:cs="BRH Devanagari Extra"/>
           <w:color w:val="000000"/>
           <w:kern w:val="0"/>
-          <w:sz w:val="48"/>
-          <w:szCs w:val="48"/>
+          <w:sz w:val="44"/>
+          <w:szCs w:val="44"/>
           <w:highlight w:val="green"/>
         </w:rPr>
         <w:t>kÉÉýlrÉþ</w:t>
@@ -391,8 +663,8 @@
           <w:rFonts w:ascii="BRH Devanagari Extra" w:hAnsi="BRH Devanagari Extra" w:cs="BRH Devanagari Extra"/>
           <w:color w:val="000000"/>
           <w:kern w:val="0"/>
-          <w:sz w:val="48"/>
-          <w:szCs w:val="48"/>
+          <w:sz w:val="44"/>
+          <w:szCs w:val="44"/>
         </w:rPr>
         <w:t xml:space="preserve">È, </w:t>
       </w:r>
@@ -401,8 +673,8 @@
           <w:rFonts w:ascii="BRH Devanagari Extra" w:hAnsi="BRH Devanagari Extra" w:cs="BRH Devanagari Extra"/>
           <w:color w:val="000000"/>
           <w:kern w:val="0"/>
-          <w:sz w:val="48"/>
-          <w:szCs w:val="48"/>
+          <w:sz w:val="44"/>
+          <w:szCs w:val="44"/>
           <w:highlight w:val="green"/>
         </w:rPr>
         <w:t>uÉÏýrÉ</w:t>
@@ -412,8 +684,8 @@
           <w:rFonts w:ascii="BRH Devanagari Extra" w:hAnsi="BRH Devanagari Extra" w:cs="BRH Devanagari Extra"/>
           <w:color w:val="000000"/>
           <w:kern w:val="0"/>
-          <w:sz w:val="48"/>
-          <w:szCs w:val="48"/>
+          <w:sz w:val="44"/>
+          <w:szCs w:val="44"/>
         </w:rPr>
         <w:t>ïÿqÉç, UÉý</w:t>
       </w:r>
@@ -422,8 +694,8 @@
           <w:rFonts w:ascii="BRH Devanagari Extra" w:hAnsi="BRH Devanagari Extra" w:cs="BRH Devanagari Extra"/>
           <w:color w:val="000000"/>
           <w:kern w:val="0"/>
-          <w:sz w:val="48"/>
-          <w:szCs w:val="48"/>
+          <w:sz w:val="44"/>
+          <w:szCs w:val="44"/>
           <w:highlight w:val="green"/>
         </w:rPr>
         <w:t>eÉýlr</w:t>
@@ -433,8 +705,8 @@
           <w:rFonts w:ascii="BRH Devanagari Extra" w:hAnsi="BRH Devanagari Extra" w:cs="BRH Devanagari Extra"/>
           <w:color w:val="000000"/>
           <w:kern w:val="0"/>
-          <w:sz w:val="48"/>
-          <w:szCs w:val="48"/>
+          <w:sz w:val="44"/>
+          <w:szCs w:val="44"/>
         </w:rPr>
         <w:t>ÉþÈ, zÉý</w:t>
       </w:r>
@@ -443,8 +715,8 @@
           <w:rFonts w:ascii="BRH Devanagari Extra" w:hAnsi="BRH Devanagari Extra" w:cs="BRH Devanagari Extra"/>
           <w:color w:val="000000"/>
           <w:kern w:val="0"/>
-          <w:sz w:val="48"/>
-          <w:szCs w:val="48"/>
+          <w:sz w:val="44"/>
+          <w:szCs w:val="44"/>
           <w:highlight w:val="green"/>
         </w:rPr>
         <w:t>UýurÉÉÿ</w:t>
@@ -454,8 +726,8 @@
           <w:rFonts w:ascii="BRH Devanagari Extra" w:hAnsi="BRH Devanagari Extra" w:cs="BRH Devanagari Extra"/>
           <w:color w:val="000000"/>
           <w:kern w:val="0"/>
-          <w:sz w:val="48"/>
-          <w:szCs w:val="48"/>
+          <w:sz w:val="44"/>
+          <w:szCs w:val="44"/>
         </w:rPr>
         <w:t>È</w:t>
       </w:r>
@@ -471,8 +743,8 @@
           <w:rFonts w:ascii="BRH Devanagari Extra" w:hAnsi="BRH Devanagari Extra" w:cs="BRH Devanagari Extra"/>
           <w:color w:val="000000"/>
           <w:kern w:val="0"/>
-          <w:sz w:val="48"/>
-          <w:szCs w:val="48"/>
+          <w:sz w:val="44"/>
+          <w:szCs w:val="44"/>
         </w:rPr>
       </w:pPr>
       <w:r>
@@ -480,8 +752,8 @@
           <w:rFonts w:ascii="BRH Devanagari Extra" w:hAnsi="BRH Devanagari Extra" w:cs="BRH Devanagari Extra"/>
           <w:color w:val="000000"/>
           <w:kern w:val="0"/>
-          <w:sz w:val="48"/>
-          <w:szCs w:val="48"/>
+          <w:sz w:val="44"/>
+          <w:szCs w:val="44"/>
         </w:rPr>
         <w:t>6. qÉkrÉ ESÉ¨ÉqÉç - qÉý</w:t>
       </w:r>
@@ -490,8 +762,8 @@
           <w:rFonts w:ascii="BRH Devanagari Extra" w:hAnsi="BRH Devanagari Extra" w:cs="BRH Devanagari Extra"/>
           <w:color w:val="000000"/>
           <w:kern w:val="0"/>
-          <w:sz w:val="48"/>
-          <w:szCs w:val="48"/>
+          <w:sz w:val="44"/>
+          <w:szCs w:val="44"/>
           <w:highlight w:val="green"/>
         </w:rPr>
         <w:t>lrÉ</w:t>
@@ -501,8 +773,8 @@
           <w:rFonts w:ascii="BRH Devanagari Extra" w:hAnsi="BRH Devanagari Extra" w:cs="BRH Devanagari Extra"/>
           <w:color w:val="000000"/>
           <w:kern w:val="0"/>
-          <w:sz w:val="48"/>
-          <w:szCs w:val="48"/>
+          <w:sz w:val="44"/>
+          <w:szCs w:val="44"/>
         </w:rPr>
         <w:t>uÉåÿ, oÉÉý</w:t>
       </w:r>
@@ -511,8 +783,8 @@
           <w:rFonts w:ascii="BRH Devanagari Extra" w:hAnsi="BRH Devanagari Extra" w:cs="BRH Devanagari Extra"/>
           <w:color w:val="000000"/>
           <w:kern w:val="0"/>
-          <w:sz w:val="48"/>
-          <w:szCs w:val="48"/>
+          <w:sz w:val="44"/>
+          <w:szCs w:val="44"/>
           <w:highlight w:val="green"/>
         </w:rPr>
         <w:t>WÒû</w:t>
@@ -522,8 +794,8 @@
           <w:rFonts w:ascii="BRH Devanagari Extra" w:hAnsi="BRH Devanagari Extra" w:cs="BRH Devanagari Extra"/>
           <w:color w:val="000000"/>
           <w:kern w:val="0"/>
-          <w:sz w:val="48"/>
-          <w:szCs w:val="48"/>
+          <w:sz w:val="44"/>
+          <w:szCs w:val="44"/>
         </w:rPr>
         <w:t xml:space="preserve">prÉÉÿqÉç, </w:t>
       </w:r>
@@ -539,8 +811,8 @@
           <w:rFonts w:ascii="BRH Devanagari Extra" w:hAnsi="BRH Devanagari Extra" w:cs="BRH Devanagari Extra"/>
           <w:color w:val="000000"/>
           <w:kern w:val="0"/>
-          <w:sz w:val="48"/>
-          <w:szCs w:val="48"/>
+          <w:sz w:val="44"/>
+          <w:szCs w:val="44"/>
         </w:rPr>
       </w:pPr>
       <w:r>
@@ -548,8 +820,8 @@
           <w:rFonts w:ascii="BRH Devanagari Extra" w:hAnsi="BRH Devanagari Extra" w:cs="BRH Devanagari Extra"/>
           <w:color w:val="000000"/>
           <w:kern w:val="0"/>
-          <w:sz w:val="48"/>
-          <w:szCs w:val="48"/>
+          <w:sz w:val="44"/>
+          <w:szCs w:val="44"/>
         </w:rPr>
         <w:t xml:space="preserve">7. </w:t>
       </w:r>
@@ -558,8 +830,8 @@
           <w:rFonts w:ascii="BRH Devanagari Extra" w:hAnsi="BRH Devanagari Extra" w:cs="BRH Devanagari Extra"/>
           <w:color w:val="000000"/>
           <w:kern w:val="0"/>
-          <w:sz w:val="48"/>
-          <w:szCs w:val="48"/>
+          <w:sz w:val="44"/>
+          <w:szCs w:val="44"/>
         </w:rPr>
         <w:t>xu</w:t>
       </w:r>
@@ -568,8 +840,8 @@
           <w:rFonts w:ascii="BRH Devanagari Extra" w:hAnsi="BRH Devanagari Extra" w:cs="BRH Devanagari Extra"/>
           <w:color w:val="000000"/>
           <w:kern w:val="0"/>
-          <w:sz w:val="48"/>
-          <w:szCs w:val="48"/>
+          <w:sz w:val="44"/>
+          <w:szCs w:val="44"/>
         </w:rPr>
         <w:t xml:space="preserve">ÉËUiÉqÉç - </w:t>
       </w:r>
@@ -578,8 +850,8 @@
           <w:rFonts w:ascii="BRH Devanagari Extra" w:hAnsi="BRH Devanagari Extra" w:cs="BRH Devanagari Extra"/>
           <w:color w:val="000000"/>
           <w:kern w:val="0"/>
-          <w:sz w:val="48"/>
-          <w:szCs w:val="48"/>
+          <w:sz w:val="44"/>
+          <w:szCs w:val="44"/>
           <w:highlight w:val="green"/>
         </w:rPr>
         <w:t>lrÉþX</w:t>
@@ -589,8 +861,8 @@
           <w:rFonts w:ascii="BRH Devanagari Extra" w:hAnsi="BRH Devanagari Extra" w:cs="BRH Devanagari Extra"/>
           <w:color w:val="000000"/>
           <w:kern w:val="0"/>
-          <w:sz w:val="48"/>
-          <w:szCs w:val="48"/>
+          <w:sz w:val="44"/>
+          <w:szCs w:val="44"/>
         </w:rPr>
         <w:t xml:space="preserve">èû, </w:t>
       </w:r>
@@ -599,8 +871,8 @@
           <w:rFonts w:ascii="BRH Devanagari Extra" w:hAnsi="BRH Devanagari Extra" w:cs="BRH Devanagari Extra"/>
           <w:color w:val="000000"/>
           <w:kern w:val="0"/>
-          <w:sz w:val="48"/>
-          <w:szCs w:val="48"/>
+          <w:sz w:val="44"/>
+          <w:szCs w:val="44"/>
           <w:highlight w:val="green"/>
         </w:rPr>
         <w:t>Yu</w:t>
@@ -610,8 +882,8 @@
           <w:rFonts w:ascii="BRH Devanagari Extra" w:hAnsi="BRH Devanagari Extra" w:cs="BRH Devanagari Extra"/>
           <w:color w:val="000000"/>
           <w:kern w:val="0"/>
-          <w:sz w:val="48"/>
-          <w:szCs w:val="48"/>
+          <w:sz w:val="44"/>
+          <w:szCs w:val="44"/>
         </w:rPr>
         <w:t>Éþ, x</w:t>
       </w:r>
@@ -620,8 +892,8 @@
           <w:rFonts w:ascii="BRH Devanagari Extra" w:hAnsi="BRH Devanagari Extra" w:cs="BRH Devanagari Extra"/>
           <w:color w:val="000000"/>
           <w:kern w:val="0"/>
-          <w:sz w:val="48"/>
-          <w:szCs w:val="48"/>
+          <w:sz w:val="44"/>
+          <w:szCs w:val="44"/>
           <w:highlight w:val="green"/>
         </w:rPr>
         <w:t>uÉþ</w:t>
@@ -631,8 +903,8 @@
           <w:rFonts w:ascii="BRH Devanagari Extra" w:hAnsi="BRH Devanagari Extra" w:cs="BRH Devanagari Extra"/>
           <w:color w:val="000000"/>
           <w:kern w:val="0"/>
-          <w:sz w:val="48"/>
-          <w:szCs w:val="48"/>
+          <w:sz w:val="44"/>
+          <w:szCs w:val="44"/>
         </w:rPr>
         <w:t>È</w:t>
       </w:r>
@@ -648,8 +920,8 @@
           <w:rFonts w:ascii="BRH Devanagari Extra" w:hAnsi="BRH Devanagari Extra" w:cs="BRH Devanagari Extra"/>
           <w:color w:val="000000"/>
           <w:kern w:val="0"/>
-          <w:sz w:val="48"/>
-          <w:szCs w:val="48"/>
+          <w:sz w:val="44"/>
+          <w:szCs w:val="44"/>
         </w:rPr>
       </w:pPr>
       <w:r>
@@ -657,8 +929,8 @@
           <w:rFonts w:ascii="BRH Devanagari Extra" w:hAnsi="BRH Devanagari Extra" w:cs="BRH Devanagari Extra"/>
           <w:color w:val="000000"/>
           <w:kern w:val="0"/>
-          <w:sz w:val="48"/>
-          <w:szCs w:val="48"/>
+          <w:sz w:val="44"/>
+          <w:szCs w:val="44"/>
         </w:rPr>
         <w:t xml:space="preserve">8. Ì² ESÉ¨ÉqÉç - </w:t>
       </w:r>
@@ -667,8 +939,8 @@
           <w:rFonts w:ascii="BRH Devanagari Extra" w:hAnsi="BRH Devanagari Extra" w:cs="BRH Devanagari Extra"/>
           <w:color w:val="000000"/>
           <w:kern w:val="0"/>
-          <w:sz w:val="48"/>
-          <w:szCs w:val="48"/>
+          <w:sz w:val="44"/>
+          <w:szCs w:val="44"/>
           <w:highlight w:val="green"/>
         </w:rPr>
         <w:t>oÉ</w:t>
@@ -678,8 +950,8 @@
           <w:rFonts w:ascii="BRH Devanagari Extra" w:hAnsi="BRH Devanagari Extra" w:cs="BRH Devanagari Extra"/>
           <w:color w:val="000000"/>
           <w:kern w:val="0"/>
-          <w:sz w:val="48"/>
-          <w:szCs w:val="48"/>
+          <w:sz w:val="44"/>
+          <w:szCs w:val="44"/>
         </w:rPr>
         <w:t>×Wûý</w:t>
       </w:r>
@@ -688,8 +960,8 @@
           <w:rFonts w:ascii="BRH Devanagari Extra" w:hAnsi="BRH Devanagari Extra" w:cs="BRH Devanagari Extra"/>
           <w:color w:val="000000"/>
           <w:kern w:val="0"/>
-          <w:sz w:val="48"/>
-          <w:szCs w:val="48"/>
+          <w:sz w:val="44"/>
+          <w:szCs w:val="44"/>
           <w:highlight w:val="green"/>
         </w:rPr>
         <w:t>xmÉ</w:t>
@@ -699,8 +971,8 @@
           <w:rFonts w:ascii="BRH Devanagari Extra" w:hAnsi="BRH Devanagari Extra" w:cs="BRH Devanagari Extra"/>
           <w:color w:val="000000"/>
           <w:kern w:val="0"/>
-          <w:sz w:val="48"/>
-          <w:szCs w:val="48"/>
+          <w:sz w:val="44"/>
+          <w:szCs w:val="44"/>
         </w:rPr>
         <w:t xml:space="preserve">ÌiÉþÈ, </w:t>
       </w:r>
@@ -709,8 +981,8 @@
           <w:rFonts w:ascii="BRH Devanagari Extra" w:hAnsi="BRH Devanagari Extra" w:cs="BRH Devanagari Extra"/>
           <w:color w:val="000000"/>
           <w:kern w:val="0"/>
-          <w:sz w:val="48"/>
-          <w:szCs w:val="48"/>
+          <w:sz w:val="44"/>
+          <w:szCs w:val="44"/>
           <w:highlight w:val="green"/>
         </w:rPr>
         <w:t>uÉÉuÉ</w:t>
@@ -726,7 +998,8 @@
         <w:rPr>
           <w:rFonts w:ascii="Segoe UI" w:hAnsi="Segoe UI" w:cs="Segoe UI"/>
           <w:kern w:val="0"/>
-          <w:sz w:val="20"/>
+          <w:sz w:val="18"/>
+          <w:szCs w:val="18"/>
         </w:rPr>
       </w:pPr>
       <w:r>
@@ -734,8 +1007,8 @@
           <w:rFonts w:ascii="BRH Devanagari Extra" w:hAnsi="BRH Devanagari Extra" w:cs="BRH Devanagari Extra"/>
           <w:color w:val="000000"/>
           <w:kern w:val="0"/>
-          <w:sz w:val="48"/>
-          <w:szCs w:val="48"/>
+          <w:sz w:val="44"/>
+          <w:szCs w:val="44"/>
         </w:rPr>
         <w:t>9. Ì§É ESÉ¨ÉqÉç - Cý</w:t>
       </w:r>
@@ -744,8 +1017,8 @@
           <w:rFonts w:ascii="BRH Devanagari Extra" w:hAnsi="BRH Devanagari Extra" w:cs="BRH Devanagari Extra"/>
           <w:color w:val="000000"/>
           <w:kern w:val="0"/>
-          <w:sz w:val="48"/>
-          <w:szCs w:val="48"/>
+          <w:sz w:val="44"/>
+          <w:szCs w:val="44"/>
           <w:highlight w:val="green"/>
         </w:rPr>
         <w:t>lSìÉåoÉ</w:t>
@@ -755,8 +1028,8 @@
           <w:rFonts w:ascii="BRH Devanagari Extra" w:hAnsi="BRH Devanagari Extra" w:cs="BRH Devanagari Extra"/>
           <w:color w:val="000000"/>
           <w:kern w:val="0"/>
-          <w:sz w:val="48"/>
-          <w:szCs w:val="48"/>
+          <w:sz w:val="44"/>
+          <w:szCs w:val="44"/>
         </w:rPr>
         <w:t>×Wûý</w:t>
       </w:r>
@@ -765,8 +1038,8 @@
           <w:rFonts w:ascii="BRH Devanagari Extra" w:hAnsi="BRH Devanagari Extra" w:cs="BRH Devanagari Extra"/>
           <w:color w:val="000000"/>
           <w:kern w:val="0"/>
-          <w:sz w:val="48"/>
-          <w:szCs w:val="48"/>
+          <w:sz w:val="44"/>
+          <w:szCs w:val="44"/>
           <w:highlight w:val="green"/>
         </w:rPr>
         <w:t>xmÉ</w:t>
@@ -776,8 +1049,8 @@
           <w:rFonts w:ascii="BRH Devanagari Extra" w:hAnsi="BRH Devanagari Extra" w:cs="BRH Devanagari Extra"/>
           <w:color w:val="000000"/>
           <w:kern w:val="0"/>
-          <w:sz w:val="48"/>
-          <w:szCs w:val="48"/>
+          <w:sz w:val="44"/>
+          <w:szCs w:val="44"/>
         </w:rPr>
         <w:t>ÌiÉþÈ,</w:t>
       </w:r>
@@ -793,7 +1066,7 @@
 </file>
 
 <file path=word/styles.xml><?xml version="1.0" encoding="utf-8"?>
-<w:styles xmlns:mc="http://schemas.openxmlformats.org/markup-compatibility/2006" xmlns:r="http://schemas.openxmlformats.org/officeDocument/2006/relationships" xmlns:w="http://schemas.openxmlformats.org/wordprocessingml/2006/main" xmlns:w14="http://schemas.microsoft.com/office/word/2010/wordml" xmlns:w15="http://schemas.microsoft.com/office/word/2012/wordml" xmlns:w16cex="http://schemas.microsoft.com/office/word/2018/wordml/cex" xmlns:w16cid="http://schemas.microsoft.com/office/word/2016/wordml/cid" xmlns:w16="http://schemas.microsoft.com/office/word/2018/wordml" xmlns:w16du="http://schemas.microsoft.com/office/word/2023/wordml/word16du" xmlns:w16sdtdh="http://schemas.microsoft.com/office/word/2020/wordml/sdtdatahash" xmlns:w16se="http://schemas.microsoft.com/office/word/2015/wordml/symex" mc:Ignorable="w14 w15 w16se w16cid w16 w16cex w16sdtdh w16du">
+<w:styles xmlns:mc="http://schemas.openxmlformats.org/markup-compatibility/2006" xmlns:r="http://schemas.openxmlformats.org/officeDocument/2006/relationships" xmlns:w="http://schemas.openxmlformats.org/wordprocessingml/2006/main" xmlns:w14="http://schemas.microsoft.com/office/word/2010/wordml" xmlns:w15="http://schemas.microsoft.com/office/word/2012/wordml" xmlns:w16cex="http://schemas.microsoft.com/office/word/2018/wordml/cex" xmlns:w16cid="http://schemas.microsoft.com/office/word/2016/wordml/cid" xmlns:w16="http://schemas.microsoft.com/office/word/2018/wordml" xmlns:w16du="http://schemas.microsoft.com/office/word/2023/wordml/word16du" xmlns:w16sdtdh="http://schemas.microsoft.com/office/word/2020/wordml/sdtdatahash" xmlns:w16sdtfl="http://schemas.microsoft.com/office/word/2024/wordml/sdtformatlock" xmlns:w16se="http://schemas.microsoft.com/office/word/2015/wordml/symex" mc:Ignorable="w14 w15 w16se w16cid w16 w16cex w16sdtdh w16sdtfl w16du">
   <w:docDefaults>
     <w:rPrDefault>
       <w:rPr>

</xml_diff>